<commit_message>
Job Search: check-in log line, interview/offer dates, weekday check-in note
The Skills-to-Openings agent (J3) gives students a line to paste into their
Job Search Check-in; the tracker template adds interview and offer dates.

Co-Authored-By: Claude Opus 5.5 <noreply@anthropic.com>
</commit_message>
<xml_diff>
--- a/assignments/JS-AI-Job-Search-Toolkit.docx
+++ b/assignments/JS-AI-Job-Search-Toolkit.docx
@@ -702,6 +702,19 @@
           <w:i w:val="0"/>
           <w:sz w:val="20"/>
         </w:rPr>
+        <w:t>When I tell you I applied to one of these jobs, give me one line to paste into my Job Search Check-in: date applied | employer | job title | where I found it | QUICK HIRE yes or no | link.</w:t>
+      </w:r>
+    </w:p>
+    <w:p>
+      <w:pPr>
+        <w:spacing w:after="20"/>
+      </w:pPr>
+      <w:r>
+        <w:rPr>
+          <w:b w:val="0"/>
+          <w:i w:val="0"/>
+          <w:sz w:val="20"/>
+        </w:rPr>
       </w:r>
     </w:p>
     <w:p>

</xml_diff>